<commit_message>
Cronogramas: agregar D15 en la semana 4
- CRONOGRAMA-NOT, -COR y -PROF: fila del Protocolo de Atención de Visitas
- NOT y COR: el Manual integra 17 documentos del programa
- Cronograma personalizable inmobiliario: generación D0–D15

Co-Authored-By: Claude Opus 5.5 <noreply@anthropic.com>
Claude-Session: https://claude.ai/code/session_016XRcxmN4rQEkHv3sZZFkKK
</commit_message>
<xml_diff>
--- a/plantillas/corredores/CRONOGRAMA-COR_Implementacion_v1.docx
+++ b/plantillas/corredores/CRONOGRAMA-COR_Implementacion_v1.docx
@@ -1171,7 +1171,7 @@
                 <w:sz w:val="18"/>
                 <w:szCs w:val="18"/>
               </w:rPr>
-              <w:t xml:space="preserve">Procedimientos y políticas integradas de los 16 documentos del programa</w:t>
+              <w:t xml:space="preserve">Procedimientos y políticas integradas de los 17 documentos del programa</w:t>
             </w:r>
           </w:p>
         </w:tc>
@@ -2290,6 +2290,80 @@
                 <w:szCs w:val="18"/>
               </w:rPr>
               <w:t xml:space="preserve">Bitácora mensual — con énfasis en los incisos b), c) y d), SIEMPRE objeto de aviso, y en los avalúos con fe pública</w:t>
+            </w:r>
+          </w:p>
+        </w:tc>
+      </w:tr>
+      <w:tr>
+        <w:tc>
+          <w:tcPr>
+            <w:tcW w:type="dxa" w:w="950"/>
+            <w:tcMar>
+              <w:top w:type="dxa" w:w="60"/>
+              <w:left w:type="dxa" w:w="90"/>
+              <w:bottom w:type="dxa" w:w="60"/>
+              <w:right w:type="dxa" w:w="90"/>
+            </w:tcMar>
+            <w:vAlign w:val="center"/>
+          </w:tcPr>
+          <w:p>
+            <w:r>
+              <w:rPr>
+                <w:rFonts w:ascii="Calibri" w:cs="Calibri" w:eastAsia="Calibri" w:hAnsi="Calibri"/>
+                <w:b w:val="false"/>
+                <w:bCs w:val="false"/>
+                <w:sz w:val="18"/>
+                <w:szCs w:val="18"/>
+              </w:rPr>
+              <w:t xml:space="preserve">D15-COR</w:t>
+            </w:r>
+          </w:p>
+        </w:tc>
+        <w:tc>
+          <w:tcPr>
+            <w:tcW w:type="dxa" w:w="3400"/>
+            <w:tcMar>
+              <w:top w:type="dxa" w:w="60"/>
+              <w:left w:type="dxa" w:w="90"/>
+              <w:bottom w:type="dxa" w:w="60"/>
+              <w:right w:type="dxa" w:w="90"/>
+            </w:tcMar>
+            <w:vAlign w:val="center"/>
+          </w:tcPr>
+          <w:p>
+            <w:r>
+              <w:rPr>
+                <w:rFonts w:ascii="Calibri" w:cs="Calibri" w:eastAsia="Calibri" w:hAnsi="Calibri"/>
+                <w:b w:val="false"/>
+                <w:bCs w:val="false"/>
+                <w:sz w:val="18"/>
+                <w:szCs w:val="18"/>
+              </w:rPr>
+              <w:t xml:space="preserve">Protocolo de Atención de Visitas</w:t>
+            </w:r>
+          </w:p>
+        </w:tc>
+        <w:tc>
+          <w:tcPr>
+            <w:tcW w:type="dxa" w:w="5000"/>
+            <w:tcMar>
+              <w:top w:type="dxa" w:w="60"/>
+              <w:left w:type="dxa" w:w="90"/>
+              <w:bottom w:type="dxa" w:w="60"/>
+              <w:right w:type="dxa" w:w="90"/>
+            </w:tcMar>
+            <w:vAlign w:val="center"/>
+          </w:tcPr>
+          <w:p>
+            <w:r>
+              <w:rPr>
+                <w:rFonts w:ascii="Calibri" w:cs="Calibri" w:eastAsia="Calibri" w:hAnsi="Calibri"/>
+                <w:b w:val="false"/>
+                <w:bCs w:val="false"/>
+                <w:sz w:val="18"/>
+                <w:szCs w:val="18"/>
+              </w:rPr>
+              <w:t xml:space="preserve">Actuación ante visitas de verificación y requerimientos del SAT: ficha de recepción, Carpeta de Visita y plazos posteriores</w:t>
             </w:r>
           </w:p>
         </w:tc>

</xml_diff>